<commit_message>
update plot for figure 3 for submission
</commit_message>
<xml_diff>
--- a/Python.Analysis/cluster_features.docx
+++ b/Python.Analysis/cluster_features.docx
@@ -159,7 +159,7 @@
                 <w:rFonts w:ascii="Calibri" w:hAnsi="Calibri"/>
                 <w:sz w:val="22"/>
               </w:rPr>
-              <w:t>(70.01%, N = 530)</w:t>
+              <w:t>(70.01% of trials, N = 530)</w:t>
             </w:r>
           </w:p>
         </w:tc>
@@ -317,7 +317,7 @@
                 <w:rFonts w:ascii="Calibri" w:hAnsi="Calibri"/>
                 <w:sz w:val="22"/>
               </w:rPr>
-              <w:t>(26.42%, N = 200)</w:t>
+              <w:t>(26.42% of trials, N = 200)</w:t>
             </w:r>
           </w:p>
         </w:tc>
@@ -475,7 +475,7 @@
                 <w:rFonts w:ascii="Calibri" w:hAnsi="Calibri"/>
                 <w:sz w:val="22"/>
               </w:rPr>
-              <w:t>(3.57%, N = 27)</w:t>
+              <w:t>(3.57% of trials, N = 27)</w:t>
             </w:r>
           </w:p>
         </w:tc>

</xml_diff>